<commit_message>
update: fix mypage and add email verification
</commit_message>
<xml_diff>
--- a/集客メーカー_校正用テキスト_全ページ版.docx
+++ b/集客メーカー_校正用テキスト_全ページ版.docx
@@ -63,147 +63,177 @@
     </w:p>
     <w:p>
       <w:r>
-        <w:t>2. Kindle出版メーカーLP（/kindle/lp）</w:t>
-      </w:r>
-    </w:p>
-    <w:p>
-      <w:r>
-        <w:t>3. Kindle代理店パートナー募集（/kindle/agency）</w:t>
-      </w:r>
-    </w:p>
-    <w:p>
-      <w:r>
-        <w:t>4. 開発支援・応援ページ（/donation）</w:t>
-      </w:r>
-    </w:p>
-    <w:p>
-      <w:r>
-        <w:t>5. 料金プラン（/pricing）</w:t>
-      </w:r>
-    </w:p>
-    <w:p>
-      <w:r>
-        <w:t>6. 全ツール一覧（/tools）</w:t>
-      </w:r>
-    </w:p>
-    <w:p>
-      <w:r>
-        <w:t>7. 診断クイズメーカーLP（/quiz）</w:t>
-      </w:r>
-    </w:p>
-    <w:p>
-      <w:r>
-        <w:t>8. プロフィールメーカーLP（/profile）</w:t>
-      </w:r>
-    </w:p>
-    <w:p>
-      <w:r>
-        <w:t>9. LPメーカーLP（/business）</w:t>
-      </w:r>
-    </w:p>
-    <w:p>
-      <w:r>
-        <w:t>10. セールスライターLP（/salesletter）</w:t>
-      </w:r>
-    </w:p>
-    <w:p>
-      <w:r>
-        <w:t>11. 予約メーカーLP（/booking）</w:t>
-      </w:r>
-    </w:p>
-    <w:p>
-      <w:r>
-        <w:t>12. アンケートメーカーLP（/survey）</w:t>
-      </w:r>
-    </w:p>
-    <w:p>
-      <w:r>
-        <w:t>13. メルマガメーカーLP（/newsletter）</w:t>
-      </w:r>
-    </w:p>
-    <w:p>
-      <w:r>
-        <w:t>14. ゲーミフィケーションLP（/gamification）</w:t>
-      </w:r>
-    </w:p>
-    <w:p>
-      <w:r>
-        <w:t>15. ウェビナーLPメーカーLP（/webinar）</w:t>
-      </w:r>
-    </w:p>
-    <w:p>
-      <w:r>
-        <w:t>16. ファネルメーカーLP（/funnel）</w:t>
-      </w:r>
-    </w:p>
-    <w:p>
-      <w:r>
-        <w:t>17. 申し込みフォームLP（/order-form）</w:t>
-      </w:r>
-    </w:p>
-    <w:p>
-      <w:r>
-        <w:t>18. マイサイトメーカーLP（/site）</w:t>
-      </w:r>
-    </w:p>
-    <w:p>
-      <w:r>
-        <w:t>19. ガイドメーカーLP（/onboarding）</w:t>
-      </w:r>
-    </w:p>
-    <w:p>
-      <w:r>
-        <w:t>20. SNS投稿メーカーLP（/sns-post）</w:t>
-      </w:r>
-    </w:p>
-    <w:p>
-      <w:r>
-        <w:t>21. サムネイルメーカーLP（/thumbnail）</w:t>
-      </w:r>
-    </w:p>
-    <w:p>
-      <w:r>
-        <w:t>22. アフィリエイトLP（/affiliate）</w:t>
-      </w:r>
-    </w:p>
-    <w:p>
-      <w:r>
-        <w:t>23. 効果的な活用法9選（/effective-use）</w:t>
-      </w:r>
-    </w:p>
-    <w:p>
-      <w:r>
-        <w:t>24. 売れるコンテンツの作り方（/selling-content）</w:t>
-      </w:r>
-    </w:p>
-    <w:p>
-      <w:r>
-        <w:t>25. 使い方・機能一覧（/howto）</w:t>
-      </w:r>
-    </w:p>
-    <w:p>
-      <w:r>
-        <w:t>26. よくある質問（/faq）</w:t>
-      </w:r>
-    </w:p>
-    <w:p>
-      <w:r>
-        <w:t>27. お問い合わせ（/contact）</w:t>
-      </w:r>
-    </w:p>
-    <w:p>
-      <w:r>
-        <w:t>28. お知らせ（/announcements）</w:t>
-      </w:r>
-    </w:p>
-    <w:p>
-      <w:r>
-        <w:t>29. 特定商取引法に基づく表記（/legal）</w:t>
-      </w:r>
-    </w:p>
-    <w:p>
-      <w:r>
-        <w:t>30. プライバシーポリシー（/privacy）</w:t>
+        <w:t>2. これから起業する方へ（/for/starter）</w:t>
+      </w:r>
+    </w:p>
+    <w:p>
+      <w:r>
+        <w:t>3. フリーランス・SNS発信者の方へ（/for/freelance）</w:t>
+      </w:r>
+    </w:p>
+    <w:p>
+      <w:r>
+        <w:t>4. コーチ・コンサル・講師の方へ（/for/coach）</w:t>
+      </w:r>
+    </w:p>
+    <w:p>
+      <w:r>
+        <w:t>5. コンテンツ販売者・Kindle著者の方へ（/for/creator）</w:t>
+      </w:r>
+    </w:p>
+    <w:p>
+      <w:r>
+        <w:t>6. 店舗・教室・サロンの方へ（/for/shop）</w:t>
+      </w:r>
+    </w:p>
+    <w:p>
+      <w:r>
+        <w:t>7. 法人・チームの方へ（/for/business）</w:t>
+      </w:r>
+    </w:p>
+    <w:p>
+      <w:r>
+        <w:t>8. Kindle出版メーカーLP（/kindle/lp）</w:t>
+      </w:r>
+    </w:p>
+    <w:p>
+      <w:r>
+        <w:t>9. Kindle代理店パートナー募集（/kindle/agency）</w:t>
+      </w:r>
+    </w:p>
+    <w:p>
+      <w:r>
+        <w:t>10. 開発支援・応援ページ（/donation）</w:t>
+      </w:r>
+    </w:p>
+    <w:p>
+      <w:r>
+        <w:t>11. 料金プラン（/pricing）</w:t>
+      </w:r>
+    </w:p>
+    <w:p>
+      <w:r>
+        <w:t>12. 全ツール一覧（/tools）</w:t>
+      </w:r>
+    </w:p>
+    <w:p>
+      <w:r>
+        <w:t>13. 診断クイズメーカーLP（/quiz）</w:t>
+      </w:r>
+    </w:p>
+    <w:p>
+      <w:r>
+        <w:t>14. プロフィールメーカーLP（/profile）</w:t>
+      </w:r>
+    </w:p>
+    <w:p>
+      <w:r>
+        <w:t>15. LPメーカーLP（/business）</w:t>
+      </w:r>
+    </w:p>
+    <w:p>
+      <w:r>
+        <w:t>16. セールスライターLP（/salesletter）</w:t>
+      </w:r>
+    </w:p>
+    <w:p>
+      <w:r>
+        <w:t>17. 予約メーカーLP（/booking）</w:t>
+      </w:r>
+    </w:p>
+    <w:p>
+      <w:r>
+        <w:t>18. アンケートメーカーLP（/survey）</w:t>
+      </w:r>
+    </w:p>
+    <w:p>
+      <w:r>
+        <w:t>19. メルマガメーカーLP（/newsletter）</w:t>
+      </w:r>
+    </w:p>
+    <w:p>
+      <w:r>
+        <w:t>20. ゲーミフィケーションLP（/gamification）</w:t>
+      </w:r>
+    </w:p>
+    <w:p>
+      <w:r>
+        <w:t>21. ウェビナーLPメーカーLP（/webinar）</w:t>
+      </w:r>
+    </w:p>
+    <w:p>
+      <w:r>
+        <w:t>22. ファネルメーカーLP（/funnel）</w:t>
+      </w:r>
+    </w:p>
+    <w:p>
+      <w:r>
+        <w:t>23. 申し込みフォームLP（/order-form）</w:t>
+      </w:r>
+    </w:p>
+    <w:p>
+      <w:r>
+        <w:t>24. マイサイトメーカーLP（/site）</w:t>
+      </w:r>
+    </w:p>
+    <w:p>
+      <w:r>
+        <w:t>25. ガイドメーカーLP（/onboarding）</w:t>
+      </w:r>
+    </w:p>
+    <w:p>
+      <w:r>
+        <w:t>26. SNS投稿メーカーLP（/sns-post）</w:t>
+      </w:r>
+    </w:p>
+    <w:p>
+      <w:r>
+        <w:t>27. サムネイルメーカーLP（/thumbnail）</w:t>
+      </w:r>
+    </w:p>
+    <w:p>
+      <w:r>
+        <w:t>28. アフィリエイトLP（/affiliate）</w:t>
+      </w:r>
+    </w:p>
+    <w:p>
+      <w:r>
+        <w:t>29. 効果的な活用法9選（/effective-use）</w:t>
+      </w:r>
+    </w:p>
+    <w:p>
+      <w:r>
+        <w:t>30. 売れるコンテンツの作り方（/selling-content）</w:t>
+      </w:r>
+    </w:p>
+    <w:p>
+      <w:r>
+        <w:t>31. 使い方・機能一覧（/howto）</w:t>
+      </w:r>
+    </w:p>
+    <w:p>
+      <w:r>
+        <w:t>32. よくある質問（/faq）</w:t>
+      </w:r>
+    </w:p>
+    <w:p>
+      <w:r>
+        <w:t>33. お問い合わせ（/contact）</w:t>
+      </w:r>
+    </w:p>
+    <w:p>
+      <w:r>
+        <w:t>34. お知らせ（/announcements）</w:t>
+      </w:r>
+    </w:p>
+    <w:p>
+      <w:r>
+        <w:t>35. 特定商取引法に基づく表記（/legal）</w:t>
+      </w:r>
+    </w:p>
+    <w:p>
+      <w:r>
+        <w:t>36. プライバシーポリシー（/privacy）</w:t>
       </w:r>
     </w:p>
     <w:p>
@@ -2152,7 +2182,2083 @@
         <w:pStyle w:val="Heading1"/>
       </w:pPr>
       <w:r>
-        <w:t>2. Kindle出版メーカーLP</w:t>
+        <w:t>2. これから起業する方へ</w:t>
+      </w:r>
+    </w:p>
+    <w:p>
+      <w:r>
+        <w:rPr>
+          <w:color w:val="646464"/>
+          <w:sz w:val="18"/>
+        </w:rPr>
+        <w:t>URL: https://makers.tokyo/for/starter</w:t>
+      </w:r>
+    </w:p>
+    <w:p/>
+    <w:p>
+      <w:pPr>
+        <w:pStyle w:val="Heading3"/>
+      </w:pPr>
+      <w:r>
+        <w:t>メタデータ（SEO）</w:t>
+      </w:r>
+    </w:p>
+    <w:p>
+      <w:r>
+        <w:rPr>
+          <w:b/>
+          <w:color w:val="505050"/>
+          <w:sz w:val="18"/>
+        </w:rPr>
+        <w:t>【title】</w:t>
+      </w:r>
+    </w:p>
+    <w:p>
+      <w:r>
+        <w:t>これから起業する方へ｜集客メーカー</w:t>
+      </w:r>
+    </w:p>
+    <w:p>
+      <w:r>
+        <w:rPr>
+          <w:b/>
+          <w:color w:val="505050"/>
+          <w:sz w:val="18"/>
+        </w:rPr>
+        <w:t>【description】</w:t>
+      </w:r>
+    </w:p>
+    <w:p>
+      <w:r>
+        <w:t>起業準備中・副業を始めたい方向け。何から始めればいいか分からない…を解決。プロフィールLP・診断クイズ・SNS投稿で「あなたを知ってもらう仕組み」をテンプレートから簡単作成。</w:t>
+      </w:r>
+    </w:p>
+    <w:p>
+      <w:pPr>
+        <w:pStyle w:val="Heading3"/>
+      </w:pPr>
+      <w:r>
+        <w:t>ヒーローセクション</w:t>
+      </w:r>
+    </w:p>
+    <w:p>
+      <w:r>
+        <w:rPr>
+          <w:b/>
+          <w:color w:val="505050"/>
+          <w:sz w:val="18"/>
+        </w:rPr>
+        <w:t>【バッジ】</w:t>
+      </w:r>
+    </w:p>
+    <w:p>
+      <w:r>
+        <w:t>これから起業・副業を始める方へ</w:t>
+      </w:r>
+    </w:p>
+    <w:p>
+      <w:r>
+        <w:rPr>
+          <w:b/>
+          <w:color w:val="505050"/>
+          <w:sz w:val="18"/>
+        </w:rPr>
+        <w:t>【見出し】</w:t>
+      </w:r>
+    </w:p>
+    <w:p>
+      <w:r>
+        <w:t>何から始めればいいか、もう迷わない。</w:t>
+      </w:r>
+    </w:p>
+    <w:p>
+      <w:r>
+        <w:rPr>
+          <w:b/>
+          <w:color w:val="505050"/>
+          <w:sz w:val="18"/>
+        </w:rPr>
+        <w:t>【説明文】</w:t>
+      </w:r>
+    </w:p>
+    <w:p>
+      <w:r>
+        <w:t>起業の第一歩は「自分を知ってもらう仕組み」をつくること。テンプレートを選ぶだけで、今日からあなたのビジネスが動き出します。</w:t>
+      </w:r>
+    </w:p>
+    <w:p>
+      <w:pPr>
+        <w:pStyle w:val="Heading3"/>
+      </w:pPr>
+      <w:r>
+        <w:t>こんなことで悩んでいませんか？</w:t>
+      </w:r>
+    </w:p>
+    <w:p>
+      <w:pPr>
+        <w:pStyle w:val="ListBullet"/>
+      </w:pPr>
+      <w:r>
+        <w:t>起業したいけど、何から手をつければいいか分からない</w:t>
+      </w:r>
+    </w:p>
+    <w:p>
+      <w:pPr>
+        <w:pStyle w:val="ListBullet"/>
+      </w:pPr>
+      <w:r>
+        <w:t>ホームページを作りたいけど、何十万も払う余裕がない</w:t>
+      </w:r>
+    </w:p>
+    <w:p>
+      <w:pPr>
+        <w:pStyle w:val="ListBullet"/>
+      </w:pPr>
+      <w:r>
+        <w:t>SNSアカウントはあるけど、ビジネスにつながっていない</w:t>
+      </w:r>
+    </w:p>
+    <w:p>
+      <w:pPr>
+        <w:pStyle w:val="ListBullet"/>
+      </w:pPr>
+      <w:r>
+        <w:t>自分のスキルや経験をどう見せればいいか分からない</w:t>
+      </w:r>
+    </w:p>
+    <w:p>
+      <w:pPr>
+        <w:pStyle w:val="ListBullet"/>
+      </w:pPr>
+      <w:r>
+        <w:t>「まずは名刺代わりのWebページを」と思いつつ、手が止まっている</w:t>
+      </w:r>
+    </w:p>
+    <w:p>
+      <w:pPr>
+        <w:pStyle w:val="Heading3"/>
+      </w:pPr>
+      <w:r>
+        <w:t>「自分を知ってもらう」が今日からできる</w:t>
+      </w:r>
+    </w:p>
+    <w:p>
+      <w:r>
+        <w:t>専門知識もデザインスキルも不要。あなたの想いをかたちにするテンプレートが揃っています。</w:t>
+      </w:r>
+    </w:p>
+    <w:p>
+      <w:r>
+        <w:rPr>
+          <w:b/>
+          <w:color w:val="505050"/>
+          <w:sz w:val="18"/>
+        </w:rPr>
+        <w:t>【あなたの魅力が伝わる】</w:t>
+      </w:r>
+    </w:p>
+    <w:p>
+      <w:r>
+        <w:t>プロフィールLPで、あなたの想い・実績・サービスを1ページにまとめて発信。SNSのプロフィール欄に貼るだけ。</w:t>
+      </w:r>
+    </w:p>
+    <w:p>
+      <w:r>
+        <w:rPr>
+          <w:b/>
+          <w:color w:val="505050"/>
+          <w:sz w:val="18"/>
+        </w:rPr>
+        <w:t>【「何者か」が一目で分かる】</w:t>
+      </w:r>
+    </w:p>
+    <w:p>
+      <w:r>
+        <w:t>診断クイズで「あなたは○○タイプ！」とお客様との接点をつくる。楽しいから自然にシェアされます。</w:t>
+      </w:r>
+    </w:p>
+    <w:p>
+      <w:r>
+        <w:rPr>
+          <w:b/>
+          <w:color w:val="505050"/>
+          <w:sz w:val="18"/>
+        </w:rPr>
+        <w:t>【発信が「集客」に変わる】</w:t>
+      </w:r>
+    </w:p>
+    <w:p>
+      <w:r>
+        <w:t>SNS投稿メーカーで、反応が取れる投稿をAIが自動生成。発信→興味→ページ訪問の流れが生まれます。</w:t>
+      </w:r>
+    </w:p>
+    <w:p>
+      <w:pPr>
+        <w:pStyle w:val="Heading3"/>
+      </w:pPr>
+      <w:r>
+        <w:t>あなた専用の「はじめの一歩」</w:t>
+      </w:r>
+    </w:p>
+    <w:p>
+      <w:r>
+        <w:t>この3つを順番につくるだけで、集客の土台が完成します。</w:t>
+      </w:r>
+    </w:p>
+    <w:p>
+      <w:r>
+        <w:rPr>
+          <w:b/>
+          <w:color w:val="505050"/>
+          <w:sz w:val="18"/>
+        </w:rPr>
+        <w:t>【STEP 1: まず、自分を紹介できるページをつくる】</w:t>
+      </w:r>
+    </w:p>
+    <w:p>
+      <w:r>
+        <w:t>テンプレートを選んで、名前・肩書き・サービス内容を入れるだけ。5分であなた専用のWebページが完成します。SNSのプロフィール欄に貼れば、名刺代わりに。</w:t>
+      </w:r>
+    </w:p>
+    <w:p>
+      <w:r>
+        <w:t>おすすめツール: プロフィールLP — テンプレートから簡単作成</w:t>
+      </w:r>
+    </w:p>
+    <w:p>
+      <w:r>
+        <w:rPr>
+          <w:b/>
+          <w:color w:val="505050"/>
+          <w:sz w:val="18"/>
+        </w:rPr>
+        <w:t>【STEP 2: 見込み客との接点をつくる】</w:t>
+      </w:r>
+    </w:p>
+    <w:p>
+      <w:r>
+        <w:t>「あなたの起業タイプ診断」「あなたに合った働き方は？」など、ターゲットが思わずやりたくなる診断クイズを作成。結果画面からあなたのサービスページへ自然に誘導できます。</w:t>
+      </w:r>
+    </w:p>
+    <w:p>
+      <w:r>
+        <w:t>おすすめツール: 診断クイズ — AIが質問・結果を自動生成</w:t>
+      </w:r>
+    </w:p>
+    <w:p>
+      <w:r>
+        <w:rPr>
+          <w:b/>
+          <w:color w:val="505050"/>
+          <w:sz w:val="18"/>
+        </w:rPr>
+        <w:t>【STEP 3: SNSで拡散される投稿をつくる】</w:t>
+      </w:r>
+    </w:p>
+    <w:p>
+      <w:r>
+        <w:t>あなたのビジネスに合わせて、反応が取れるSNS投稿文をAIが自動生成。投稿→プロフィールLP→サービスページという集客の流れが自然に生まれます。</w:t>
+      </w:r>
+    </w:p>
+    <w:p>
+      <w:r>
+        <w:t>おすすめツール: SNS投稿メーカー — AI自動生成＆テンプレート</w:t>
+      </w:r>
+    </w:p>
+    <w:p>
+      <w:pPr>
+        <w:pStyle w:val="Heading3"/>
+      </w:pPr>
+      <w:r>
+        <w:t>お客様の声（イメージ）</w:t>
+      </w:r>
+    </w:p>
+    <w:p>
+      <w:r>
+        <w:rPr>
+          <w:b/>
+          <w:color w:val="505050"/>
+          <w:sz w:val="18"/>
+        </w:rPr>
+        <w:t>【Before】</w:t>
+      </w:r>
+    </w:p>
+    <w:p>
+      <w:r>
+        <w:t>アメブロとInstagramで発信していたけど、サービス内容を伝えるページがなく、問い合わせはDMで月1件あるかないか。何から手をつければいいか分からず、半年が過ぎていた。</w:t>
+      </w:r>
+    </w:p>
+    <w:p>
+      <w:r>
+        <w:rPr>
+          <w:b/>
+          <w:color w:val="505050"/>
+          <w:sz w:val="18"/>
+        </w:rPr>
+        <w:t>【After】</w:t>
+      </w:r>
+    </w:p>
+    <w:p>
+      <w:r>
+        <w:t>プロフィールLPをつくってSNSに貼ったら、「サービス内容がよく分かった」と言われるように。診断クイズをシェアしたら友人経由で初めてのお客様が。月5件のお問い合わせが来るようになった。</w:t>
+      </w:r>
+    </w:p>
+    <w:p>
+      <w:r>
+        <w:rPr>
+          <w:b/>
+          <w:color w:val="505050"/>
+          <w:sz w:val="18"/>
+        </w:rPr>
+        <w:t>【ペルソナ】</w:t>
+      </w:r>
+    </w:p>
+    <w:p>
+      <w:r>
+        <w:t>30代女性・ヨガインストラクター（起業準備中）のイメージ</w:t>
+      </w:r>
+    </w:p>
+    <w:p>
+      <w:r>
+        <w:br w:type="page"/>
+      </w:r>
+    </w:p>
+    <w:p>
+      <w:pPr>
+        <w:pStyle w:val="Heading1"/>
+      </w:pPr>
+      <w:r>
+        <w:t>3. フリーランス・SNS発信者の方へ</w:t>
+      </w:r>
+    </w:p>
+    <w:p>
+      <w:r>
+        <w:rPr>
+          <w:color w:val="646464"/>
+          <w:sz w:val="18"/>
+        </w:rPr>
+        <w:t>URL: https://makers.tokyo/for/freelance</w:t>
+      </w:r>
+    </w:p>
+    <w:p/>
+    <w:p>
+      <w:pPr>
+        <w:pStyle w:val="Heading3"/>
+      </w:pPr>
+      <w:r>
+        <w:t>メタデータ（SEO）</w:t>
+      </w:r>
+    </w:p>
+    <w:p>
+      <w:r>
+        <w:rPr>
+          <w:b/>
+          <w:color w:val="505050"/>
+          <w:sz w:val="18"/>
+        </w:rPr>
+        <w:t>【title】</w:t>
+      </w:r>
+    </w:p>
+    <w:p>
+      <w:r>
+        <w:t>フリーランス・SNS発信者の方へ｜集客メーカー</w:t>
+      </w:r>
+    </w:p>
+    <w:p>
+      <w:r>
+        <w:rPr>
+          <w:b/>
+          <w:color w:val="505050"/>
+          <w:sz w:val="18"/>
+        </w:rPr>
+        <w:t>【description】</w:t>
+      </w:r>
+    </w:p>
+    <w:p>
+      <w:r>
+        <w:t>フリーランス・個人事業主・SNS発信者向け。フォロワーを「お客様」に変える仕組みを無料で構築。プロフィールLP・診断クイズ・予約フォームの組み合わせで自然に予約が入る流れを。</w:t>
+      </w:r>
+    </w:p>
+    <w:p>
+      <w:pPr>
+        <w:pStyle w:val="Heading3"/>
+      </w:pPr>
+      <w:r>
+        <w:t>ヒーローセクション</w:t>
+      </w:r>
+    </w:p>
+    <w:p>
+      <w:r>
+        <w:rPr>
+          <w:b/>
+          <w:color w:val="505050"/>
+          <w:sz w:val="18"/>
+        </w:rPr>
+        <w:t>【バッジ】</w:t>
+      </w:r>
+    </w:p>
+    <w:p>
+      <w:r>
+        <w:t>フリーランス・SNS発信者の方へ</w:t>
+      </w:r>
+    </w:p>
+    <w:p>
+      <w:r>
+        <w:rPr>
+          <w:b/>
+          <w:color w:val="505050"/>
+          <w:sz w:val="18"/>
+        </w:rPr>
+        <w:t>【見出し】</w:t>
+      </w:r>
+    </w:p>
+    <w:p>
+      <w:r>
+        <w:t>フォロワーを、「お客様」に変える。</w:t>
+      </w:r>
+    </w:p>
+    <w:p>
+      <w:r>
+        <w:rPr>
+          <w:b/>
+          <w:color w:val="505050"/>
+          <w:sz w:val="18"/>
+        </w:rPr>
+        <w:t>【説明文】</w:t>
+      </w:r>
+    </w:p>
+    <w:p>
+      <w:r>
+        <w:t>毎日がんばって発信しているのに、売上につながらない。それは「仕組み」がないから。フォロワーが自然にお客様に変わる流れを、今日からつくれます。</w:t>
+      </w:r>
+    </w:p>
+    <w:p>
+      <w:pPr>
+        <w:pStyle w:val="Heading3"/>
+      </w:pPr>
+      <w:r>
+        <w:t>こんなことで悩んでいませんか？</w:t>
+      </w:r>
+    </w:p>
+    <w:p>
+      <w:pPr>
+        <w:pStyle w:val="ListBullet"/>
+      </w:pPr>
+      <w:r>
+        <w:t>フォロワーは増えているのに、売上が増えない</w:t>
+      </w:r>
+    </w:p>
+    <w:p>
+      <w:pPr>
+        <w:pStyle w:val="ListBullet"/>
+      </w:pPr>
+      <w:r>
+        <w:t>DMで問い合わせが来ても、予約の日程調整が面倒</w:t>
+      </w:r>
+    </w:p>
+    <w:p>
+      <w:pPr>
+        <w:pStyle w:val="ListBullet"/>
+      </w:pPr>
+      <w:r>
+        <w:t>「何をやっている人か」がフォロワーに伝わっていない気がする</w:t>
+      </w:r>
+    </w:p>
+    <w:p>
+      <w:pPr>
+        <w:pStyle w:val="ListBullet"/>
+      </w:pPr>
+      <w:r>
+        <w:t>投稿のネタ切れで、発信を続けるのがしんどい</w:t>
+      </w:r>
+    </w:p>
+    <w:p>
+      <w:pPr>
+        <w:pStyle w:val="ListBullet"/>
+      </w:pPr>
+      <w:r>
+        <w:t>lit.linkやLinktreeを使っているけど、差別化できない</w:t>
+      </w:r>
+    </w:p>
+    <w:p>
+      <w:pPr>
+        <w:pStyle w:val="Heading3"/>
+      </w:pPr>
+      <w:r>
+        <w:t>発信が「集客」に変わる3つの仕組み</w:t>
+      </w:r>
+    </w:p>
+    <w:p>
+      <w:r>
+        <w:t>SNSの発信力をそのまま売上に変える。あなただけの集客ファネルを無料で構築できます。</w:t>
+      </w:r>
+    </w:p>
+    <w:p>
+      <w:r>
+        <w:rPr>
+          <w:b/>
+          <w:color w:val="505050"/>
+          <w:sz w:val="18"/>
+        </w:rPr>
+        <w:t>【「何者か」が一目で伝わる】</w:t>
+      </w:r>
+    </w:p>
+    <w:p>
+      <w:r>
+        <w:t>プロフィールLPで、あなたのサービス・実績・人柄を1ページに凝縮。lit.linkの代わりに、もっと伝わるページを。</w:t>
+      </w:r>
+    </w:p>
+    <w:p>
+      <w:r>
+        <w:rPr>
+          <w:b/>
+          <w:color w:val="505050"/>
+          <w:sz w:val="18"/>
+        </w:rPr>
+        <w:t>【興味を「行動」に変える】</w:t>
+      </w:r>
+    </w:p>
+    <w:p>
+      <w:r>
+        <w:t>「あなたのタイプ診断」で見込み客の興味を引き、結果画面からサービスページへ自然に誘導。楽しいから拡散もされます。</w:t>
+      </w:r>
+    </w:p>
+    <w:p>
+      <w:r>
+        <w:rPr>
+          <w:b/>
+          <w:color w:val="505050"/>
+          <w:sz w:val="18"/>
+        </w:rPr>
+        <w:t>【予約が自動で入る】</w:t>
+      </w:r>
+    </w:p>
+    <w:p>
+      <w:r>
+        <w:t>予約フォームを設置すれば、DMでのやり取り不要。空き状況を見てそのまま予約完了。取りこぼしゼロに。</w:t>
+      </w:r>
+    </w:p>
+    <w:p>
+      <w:pPr>
+        <w:pStyle w:val="Heading3"/>
+      </w:pPr>
+      <w:r>
+        <w:t>フォロワーがお客様に変わる3ステップ</w:t>
+      </w:r>
+    </w:p>
+    <w:p>
+      <w:r>
+        <w:t>この流れをつくるだけで、SNSの発信が「集客の仕組み」になります。</w:t>
+      </w:r>
+    </w:p>
+    <w:p>
+      <w:r>
+        <w:rPr>
+          <w:b/>
+          <w:color w:val="505050"/>
+          <w:sz w:val="18"/>
+        </w:rPr>
+        <w:t>【STEP 1: 「あなたのすべて」が伝わるページをつくる】</w:t>
+      </w:r>
+    </w:p>
+    <w:p>
+      <w:r>
+        <w:t>サービス内容・料金・お客様の声・予約ボタンを1ページにまとめたプロフィールLP。SNSのプロフィール欄に貼るだけで、フォロワーがあなたのサービスを理解できます。</w:t>
+      </w:r>
+    </w:p>
+    <w:p>
+      <w:r>
+        <w:t>おすすめツール: プロフィールLP — lit.linkより伝わるページ</w:t>
+      </w:r>
+    </w:p>
+    <w:p>
+      <w:r>
+        <w:rPr>
+          <w:b/>
+          <w:color w:val="505050"/>
+          <w:sz w:val="18"/>
+        </w:rPr>
+        <w:t>【STEP 2: 「思わずやりたくなる」診断で接点をつくる】</w:t>
+      </w:r>
+    </w:p>
+    <w:p>
+      <w:r>
+        <w:t>「あなたに合ったダイエット法は？」「あなたの強みタイプ診断」など、ターゲットが思わずシェアしたくなる診断クイズ。結果画面にあなたのサービスを自然に紹介できます。</w:t>
+      </w:r>
+    </w:p>
+    <w:p>
+      <w:r>
+        <w:t>おすすめツール: 診断クイズ — AIが質問・結果を自動生成</w:t>
+      </w:r>
+    </w:p>
+    <w:p>
+      <w:r>
+        <w:rPr>
+          <w:b/>
+          <w:color w:val="505050"/>
+          <w:sz w:val="18"/>
+        </w:rPr>
+        <w:t>【STEP 3: 予約・申込を自動化する】</w:t>
+      </w:r>
+    </w:p>
+    <w:p>
+      <w:r>
+        <w:t>「いつ空いてますか？」のDMやり取りは卒業。カレンダー型の予約フォームで、見込み客がそのまま予約完了。あなたは承認するだけです。</w:t>
+      </w:r>
+    </w:p>
+    <w:p>
+      <w:r>
+        <w:t>おすすめツール: 予約フォーム — 日程調整を自動化</w:t>
+      </w:r>
+    </w:p>
+    <w:p>
+      <w:pPr>
+        <w:pStyle w:val="Heading3"/>
+      </w:pPr>
+      <w:r>
+        <w:t>お客様の声（イメージ）</w:t>
+      </w:r>
+    </w:p>
+    <w:p>
+      <w:r>
+        <w:rPr>
+          <w:b/>
+          <w:color w:val="505050"/>
+          <w:sz w:val="18"/>
+        </w:rPr>
+        <w:t>【Before】</w:t>
+      </w:r>
+    </w:p>
+    <w:p>
+      <w:r>
+        <w:t>Instagramのフォロワーは3,000人いるのに、月の売上は5万円程度。DMで予約のやり取りをするのが面倒で、返信が遅れてお客様を逃すことも。プロフィールのリンクはlit.linkだけど、サービス内容がうまく伝わっていなかった。</w:t>
+      </w:r>
+    </w:p>
+    <w:p>
+      <w:r>
+        <w:rPr>
+          <w:b/>
+          <w:color w:val="505050"/>
+          <w:sz w:val="18"/>
+        </w:rPr>
+        <w:t>【After】</w:t>
+      </w:r>
+    </w:p>
+    <w:p>
+      <w:r>
+        <w:t>プロフィールLPに変えたら「サービスの全体像が分かりやすい」と好評。診断クイズがストーリーでシェアされて新規フォロワーが増え、予約フォームを設置したら月15件の予約が自動で入るように。売上は月25万円に。</w:t>
+      </w:r>
+    </w:p>
+    <w:p>
+      <w:r>
+        <w:rPr>
+          <w:b/>
+          <w:color w:val="505050"/>
+          <w:sz w:val="18"/>
+        </w:rPr>
+        <w:t>【ペルソナ】</w:t>
+      </w:r>
+    </w:p>
+    <w:p>
+      <w:r>
+        <w:t>20代女性・パーソナルスタイリスト（フリーランス）のイメージ</w:t>
+      </w:r>
+    </w:p>
+    <w:p>
+      <w:r>
+        <w:br w:type="page"/>
+      </w:r>
+    </w:p>
+    <w:p>
+      <w:pPr>
+        <w:pStyle w:val="Heading1"/>
+      </w:pPr>
+      <w:r>
+        <w:t>4. コーチ・コンサル・講師の方へ</w:t>
+      </w:r>
+    </w:p>
+    <w:p>
+      <w:r>
+        <w:rPr>
+          <w:color w:val="646464"/>
+          <w:sz w:val="18"/>
+        </w:rPr>
+        <w:t>URL: https://makers.tokyo/for/coach</w:t>
+      </w:r>
+    </w:p>
+    <w:p/>
+    <w:p>
+      <w:pPr>
+        <w:pStyle w:val="Heading3"/>
+      </w:pPr>
+      <w:r>
+        <w:t>メタデータ（SEO）</w:t>
+      </w:r>
+    </w:p>
+    <w:p>
+      <w:r>
+        <w:rPr>
+          <w:b/>
+          <w:color w:val="505050"/>
+          <w:sz w:val="18"/>
+        </w:rPr>
+        <w:t>【title】</w:t>
+      </w:r>
+    </w:p>
+    <w:p>
+      <w:r>
+        <w:t>コーチ・コンサル・講師の方へ｜集客メーカー</w:t>
+      </w:r>
+    </w:p>
+    <w:p>
+      <w:r>
+        <w:rPr>
+          <w:b/>
+          <w:color w:val="505050"/>
+          <w:sz w:val="18"/>
+        </w:rPr>
+        <w:t>【description】</w:t>
+      </w:r>
+    </w:p>
+    <w:p>
+      <w:r>
+        <w:t>コーチ・コンサルタント・講師向け。「実力」を正しく伝え、予約が自然に入る仕組みを無料構築。ウェビナーLP・ステップメール・予約フォームで見込み客を育てます。</w:t>
+      </w:r>
+    </w:p>
+    <w:p>
+      <w:pPr>
+        <w:pStyle w:val="Heading3"/>
+      </w:pPr>
+      <w:r>
+        <w:t>ヒーローセクション</w:t>
+      </w:r>
+    </w:p>
+    <w:p>
+      <w:r>
+        <w:rPr>
+          <w:b/>
+          <w:color w:val="505050"/>
+          <w:sz w:val="18"/>
+        </w:rPr>
+        <w:t>【バッジ】</w:t>
+      </w:r>
+    </w:p>
+    <w:p>
+      <w:r>
+        <w:t>コーチ・コンサル・講師の方へ</w:t>
+      </w:r>
+    </w:p>
+    <w:p>
+      <w:r>
+        <w:rPr>
+          <w:b/>
+          <w:color w:val="505050"/>
+          <w:sz w:val="18"/>
+        </w:rPr>
+        <w:t>【見出し】</w:t>
+      </w:r>
+    </w:p>
+    <w:p>
+      <w:r>
+        <w:t>「実力」を正しく伝え、予約が自然に入る。</w:t>
+      </w:r>
+    </w:p>
+    <w:p>
+      <w:r>
+        <w:rPr>
+          <w:b/>
+          <w:color w:val="505050"/>
+          <w:sz w:val="18"/>
+        </w:rPr>
+        <w:t>【説明文】</w:t>
+      </w:r>
+    </w:p>
+    <w:p>
+      <w:r>
+        <w:t>コーチ・コンサルの集客は「信頼」がすべて。あなたの専門性を可視化し、見込み客を育て、自然に予約につなげる仕組みをつくりませんか。</w:t>
+      </w:r>
+    </w:p>
+    <w:p>
+      <w:pPr>
+        <w:pStyle w:val="Heading3"/>
+      </w:pPr>
+      <w:r>
+        <w:t>こんなことで悩んでいませんか？</w:t>
+      </w:r>
+    </w:p>
+    <w:p>
+      <w:pPr>
+        <w:pStyle w:val="ListBullet"/>
+      </w:pPr>
+      <w:r>
+        <w:t>セッションの質には自信があるのに、新規のお客様が来ない</w:t>
+      </w:r>
+    </w:p>
+    <w:p>
+      <w:pPr>
+        <w:pStyle w:val="ListBullet"/>
+      </w:pPr>
+      <w:r>
+        <w:t>セミナーを開催しても、そこから個別相談につながらない</w:t>
+      </w:r>
+    </w:p>
+    <w:p>
+      <w:pPr>
+        <w:pStyle w:val="ListBullet"/>
+      </w:pPr>
+      <w:r>
+        <w:t>「もっと実績を見せたい」けど、見せ方が分からない</w:t>
+      </w:r>
+    </w:p>
+    <w:p>
+      <w:pPr>
+        <w:pStyle w:val="ListBullet"/>
+      </w:pPr>
+      <w:r>
+        <w:t>ステップメールを送りたいけど、ツールが高すぎる</w:t>
+      </w:r>
+    </w:p>
+    <w:p>
+      <w:pPr>
+        <w:pStyle w:val="ListBullet"/>
+      </w:pPr>
+      <w:r>
+        <w:t>お客様の声をもらっても、うまく活用できていない</w:t>
+      </w:r>
+    </w:p>
+    <w:p>
+      <w:pPr>
+        <w:pStyle w:val="Heading3"/>
+      </w:pPr>
+      <w:r>
+        <w:t>信頼を可視化して予約につなげる</w:t>
+      </w:r>
+    </w:p>
+    <w:p>
+      <w:r>
+        <w:t>あなたの専門性・実績・人柄を「仕組み」で伝えることで、見込み客が安心して予約できます。</w:t>
+      </w:r>
+    </w:p>
+    <w:p>
+      <w:r>
+        <w:rPr>
+          <w:b/>
+          <w:color w:val="505050"/>
+          <w:sz w:val="18"/>
+        </w:rPr>
+        <w:t>【専門性が「見える」】</w:t>
+      </w:r>
+    </w:p>
+    <w:p>
+      <w:r>
+        <w:t>ウェビナーLPで、あなたのセミナー・講座を魅力的に紹介。参加者が「この人に相談したい」と思えるページが5分で完成。</w:t>
+      </w:r>
+    </w:p>
+    <w:p>
+      <w:r>
+        <w:rPr>
+          <w:b/>
+          <w:color w:val="505050"/>
+          <w:sz w:val="18"/>
+        </w:rPr>
+        <w:t>【信頼が「育つ」】</w:t>
+      </w:r>
+    </w:p>
+    <w:p>
+      <w:r>
+        <w:t>ステップメールで、セミナー参加後のフォローアップを自動化。お役立ち情報→事例紹介→個別相談のご案内と、自然な流れで信頼を積み重ねます。</w:t>
+      </w:r>
+    </w:p>
+    <w:p>
+      <w:r>
+        <w:rPr>
+          <w:b/>
+          <w:color w:val="505050"/>
+          <w:sz w:val="18"/>
+        </w:rPr>
+        <w:t>【予約が「入る」】</w:t>
+      </w:r>
+    </w:p>
+    <w:p>
+      <w:r>
+        <w:t>個別相談・体験セッションの予約が24時間自動受付。「いつ空いてますか？」のやり取りは一切不要になります。</w:t>
+      </w:r>
+    </w:p>
+    <w:p>
+      <w:pPr>
+        <w:pStyle w:val="Heading3"/>
+      </w:pPr>
+      <w:r>
+        <w:t>見込み客が「この人にお願いしたい」と思う流れ</w:t>
+      </w:r>
+    </w:p>
+    <w:p>
+      <w:r>
+        <w:t>セミナー集客 → 信頼構築 → 個別相談という王道の流れを仕組み化します。</w:t>
+      </w:r>
+    </w:p>
+    <w:p>
+      <w:r>
+        <w:rPr>
+          <w:b/>
+          <w:color w:val="505050"/>
+          <w:sz w:val="18"/>
+        </w:rPr>
+        <w:t>【STEP 1: セミナー・講座のLPで集客する】</w:t>
+      </w:r>
+    </w:p>
+    <w:p>
+      <w:r>
+        <w:t>ウェビナーLPで、あなたのセミナーや無料相談会を告知。「講師プロフィール」「参加者の声」「こんな方におすすめ」など、参加を後押しする要素をテンプレートに沿って入力するだけ。</w:t>
+      </w:r>
+    </w:p>
+    <w:p>
+      <w:r>
+        <w:t>おすすめツール: ウェビナーLP — セミナー告知ページを簡単作成</w:t>
+      </w:r>
+    </w:p>
+    <w:p>
+      <w:r>
+        <w:rPr>
+          <w:b/>
+          <w:color w:val="505050"/>
+          <w:sz w:val="18"/>
+        </w:rPr>
+        <w:t>【STEP 2: ステップメールで信頼を育てる】</w:t>
+      </w:r>
+    </w:p>
+    <w:p>
+      <w:r>
+        <w:t>セミナー参加者に自動でフォローアップメールを送信。「お役立ち情報」→「成功事例」→「個別相談のご案内」と段階的に信頼を構築。あなたが寝ている間も、見込み客との関係が深まります。</w:t>
+      </w:r>
+    </w:p>
+    <w:p>
+      <w:r>
+        <w:t>おすすめツール: ステップメール — 自動フォローアップ配信</w:t>
+      </w:r>
+    </w:p>
+    <w:p>
+      <w:r>
+        <w:rPr>
+          <w:b/>
+          <w:color w:val="505050"/>
+          <w:sz w:val="18"/>
+        </w:rPr>
+        <w:t>【STEP 3: 個別相談の予約を自動で受け付ける】</w:t>
+      </w:r>
+    </w:p>
+    <w:p>
+      <w:r>
+        <w:t>信頼が高まったタイミングで、ワンクリックで個別相談を予約できる導線を設置。カレンダーから空き日時を選ぶだけなので、見込み客の「今すぐ相談したい」を逃しません。</w:t>
+      </w:r>
+    </w:p>
+    <w:p>
+      <w:r>
+        <w:t>おすすめツール: 予約フォーム — 24時間自動予約受付</w:t>
+      </w:r>
+    </w:p>
+    <w:p>
+      <w:pPr>
+        <w:pStyle w:val="Heading3"/>
+      </w:pPr>
+      <w:r>
+        <w:t>お客様の声（イメージ）</w:t>
+      </w:r>
+    </w:p>
+    <w:p>
+      <w:r>
+        <w:rPr>
+          <w:b/>
+          <w:color w:val="505050"/>
+          <w:sz w:val="18"/>
+        </w:rPr>
+        <w:t>【Before】</w:t>
+      </w:r>
+    </w:p>
+    <w:p>
+      <w:r>
+        <w:t>月2回のセミナーを開催していたが、参加者は毎回5〜8名。個別相談に進む人は1〜2名。フォローアップは手動でメールを送っていたが、忙しくて3日後になることも。もっと体系的にやりたいと思いつつ、ツールの費用が気になっていた。</w:t>
+      </w:r>
+    </w:p>
+    <w:p>
+      <w:r>
+        <w:rPr>
+          <w:b/>
+          <w:color w:val="505050"/>
+          <w:sz w:val="18"/>
+        </w:rPr>
+        <w:t>【After】</w:t>
+      </w:r>
+    </w:p>
+    <w:p>
+      <w:r>
+        <w:t>ウェビナーLPでセミナー告知を一本化したら、参加者が平均15名に。ステップメールで自動フォローを始めたら、個別相談への転換率が40%に向上。月8件の個別相談が安定して入るようになり、成約率も上がった。</w:t>
+      </w:r>
+    </w:p>
+    <w:p>
+      <w:r>
+        <w:rPr>
+          <w:b/>
+          <w:color w:val="505050"/>
+          <w:sz w:val="18"/>
+        </w:rPr>
+        <w:t>【ペルソナ】</w:t>
+      </w:r>
+    </w:p>
+    <w:p>
+      <w:r>
+        <w:t>40代男性・ビジネスコンサルタント（独立3年目）のイメージ</w:t>
+      </w:r>
+    </w:p>
+    <w:p>
+      <w:r>
+        <w:br w:type="page"/>
+      </w:r>
+    </w:p>
+    <w:p>
+      <w:pPr>
+        <w:pStyle w:val="Heading1"/>
+      </w:pPr>
+      <w:r>
+        <w:t>5. コンテンツ販売者・Kindle著者の方へ</w:t>
+      </w:r>
+    </w:p>
+    <w:p>
+      <w:r>
+        <w:rPr>
+          <w:color w:val="646464"/>
+          <w:sz w:val="18"/>
+        </w:rPr>
+        <w:t>URL: https://makers.tokyo/for/creator</w:t>
+      </w:r>
+    </w:p>
+    <w:p/>
+    <w:p>
+      <w:pPr>
+        <w:pStyle w:val="Heading3"/>
+      </w:pPr>
+      <w:r>
+        <w:t>メタデータ（SEO）</w:t>
+      </w:r>
+    </w:p>
+    <w:p>
+      <w:r>
+        <w:rPr>
+          <w:b/>
+          <w:color w:val="505050"/>
+          <w:sz w:val="18"/>
+        </w:rPr>
+        <w:t>【title】</w:t>
+      </w:r>
+    </w:p>
+    <w:p>
+      <w:r>
+        <w:t>コンテンツ販売・Kindle著者の方へ｜集客メーカー</w:t>
+      </w:r>
+    </w:p>
+    <w:p>
+      <w:r>
+        <w:rPr>
+          <w:b/>
+          <w:color w:val="505050"/>
+          <w:sz w:val="18"/>
+        </w:rPr>
+        <w:t>【description】</w:t>
+      </w:r>
+    </w:p>
+    <w:p>
+      <w:r>
+        <w:t>コンテンツ販売者・Kindle著者・情報発信者向け。見込み客を育て、商品が売れ続ける仕組みを無料構築。セールスライター・ファネル・メルマガで自動化。</w:t>
+      </w:r>
+    </w:p>
+    <w:p>
+      <w:pPr>
+        <w:pStyle w:val="Heading3"/>
+      </w:pPr>
+      <w:r>
+        <w:t>ヒーローセクション</w:t>
+      </w:r>
+    </w:p>
+    <w:p>
+      <w:r>
+        <w:rPr>
+          <w:b/>
+          <w:color w:val="505050"/>
+          <w:sz w:val="18"/>
+        </w:rPr>
+        <w:t>【バッジ】</w:t>
+      </w:r>
+    </w:p>
+    <w:p>
+      <w:r>
+        <w:t>コンテンツ販売者・Kindle著者の方へ</w:t>
+      </w:r>
+    </w:p>
+    <w:p>
+      <w:r>
+        <w:rPr>
+          <w:b/>
+          <w:color w:val="505050"/>
+          <w:sz w:val="18"/>
+        </w:rPr>
+        <w:t>【見出し】</w:t>
+      </w:r>
+    </w:p>
+    <w:p>
+      <w:r>
+        <w:t>良い商品があるのに、売れない理由は「導線」。</w:t>
+      </w:r>
+    </w:p>
+    <w:p>
+      <w:r>
+        <w:rPr>
+          <w:b/>
+          <w:color w:val="505050"/>
+          <w:sz w:val="18"/>
+        </w:rPr>
+        <w:t>【説明文】</w:t>
+      </w:r>
+    </w:p>
+    <w:p>
+      <w:r>
+        <w:t>見込み客との関係を育て、「欲しい」と思ったタイミングで届ける。商品が売れ続ける「仕組み」をテンプレートから簡単に構築できます。</w:t>
+      </w:r>
+    </w:p>
+    <w:p>
+      <w:pPr>
+        <w:pStyle w:val="Heading3"/>
+      </w:pPr>
+      <w:r>
+        <w:t>こんなことで悩んでいませんか？</w:t>
+      </w:r>
+    </w:p>
+    <w:p>
+      <w:pPr>
+        <w:pStyle w:val="ListBullet"/>
+      </w:pPr>
+      <w:r>
+        <w:t>良い商品をつくったのに、思ったように売れない</w:t>
+      </w:r>
+    </w:p>
+    <w:p>
+      <w:pPr>
+        <w:pStyle w:val="ListBullet"/>
+      </w:pPr>
+      <w:r>
+        <w:t>SNSで告知しても反応が薄く、販売のたびに疲弊する</w:t>
+      </w:r>
+    </w:p>
+    <w:p>
+      <w:pPr>
+        <w:pStyle w:val="ListBullet"/>
+      </w:pPr>
+      <w:r>
+        <w:t>「売り込み」が苦手で、セールスレターを書くのがつらい</w:t>
+      </w:r>
+    </w:p>
+    <w:p>
+      <w:pPr>
+        <w:pStyle w:val="ListBullet"/>
+      </w:pPr>
+      <w:r>
+        <w:t>メルマガをやりたいけど、何を書けばいいか分からない</w:t>
+      </w:r>
+    </w:p>
+    <w:p>
+      <w:pPr>
+        <w:pStyle w:val="ListBullet"/>
+      </w:pPr>
+      <w:r>
+        <w:t>一度買ってくれた人に、次の商品を案内する仕組みがない</w:t>
+      </w:r>
+    </w:p>
+    <w:p>
+      <w:pPr>
+        <w:pStyle w:val="Heading3"/>
+      </w:pPr>
+      <w:r>
+        <w:t>商品が「売れ続ける」仕組みをつくる</w:t>
+      </w:r>
+    </w:p>
+    <w:p>
+      <w:r>
+        <w:t>売り込まなくても売れる。見込み客との関係を育て、自然に購入につながる流れを自動化します。</w:t>
+      </w:r>
+    </w:p>
+    <w:p>
+      <w:r>
+        <w:rPr>
+          <w:b/>
+          <w:color w:val="505050"/>
+          <w:sz w:val="18"/>
+        </w:rPr>
+        <w:t>【売れる文章をAIが書く】</w:t>
+      </w:r>
+    </w:p>
+    <w:p>
+      <w:r>
+        <w:t>セールスライターが、あなたの商品の魅力を最大限に引き出すセールスレターを自動生成。「売り込み」ではなく「価値を伝える」文章に。</w:t>
+      </w:r>
+    </w:p>
+    <w:p>
+      <w:r>
+        <w:rPr>
+          <w:b/>
+          <w:color w:val="505050"/>
+          <w:sz w:val="18"/>
+        </w:rPr>
+        <w:t>【見込み客を自動で育てる】</w:t>
+      </w:r>
+    </w:p>
+    <w:p>
+      <w:r>
+        <w:t>ファネルで、認知→興味→検討→購入の流れを自動構築。一度つくれば、あなたが寝ている間も見込み客が育ちます。</w:t>
+      </w:r>
+    </w:p>
+    <w:p>
+      <w:r>
+        <w:rPr>
+          <w:b/>
+          <w:color w:val="505050"/>
+          <w:sz w:val="18"/>
+        </w:rPr>
+        <w:t>【リピーターが生まれる】</w:t>
+      </w:r>
+    </w:p>
+    <w:p>
+      <w:r>
+        <w:t>メルマガで購入者との関係を維持。新商品のお知らせ、お役立ち情報の配信で、一度きりのお客様がファンに変わります。</w:t>
+      </w:r>
+    </w:p>
+    <w:p>
+      <w:pPr>
+        <w:pStyle w:val="Heading3"/>
+      </w:pPr>
+      <w:r>
+        <w:t>「つくって終わり」から「売れ続ける」へ</w:t>
+      </w:r>
+    </w:p>
+    <w:p>
+      <w:r>
+        <w:t>商品をつくるだけでなく、売れる流れまでを仕組み化します。</w:t>
+      </w:r>
+    </w:p>
+    <w:p>
+      <w:r>
+        <w:rPr>
+          <w:b/>
+          <w:color w:val="505050"/>
+          <w:sz w:val="18"/>
+        </w:rPr>
+        <w:t>【STEP 1: 「欲しい！」と思わせるセールスページをつくる】</w:t>
+      </w:r>
+    </w:p>
+    <w:p>
+      <w:r>
+        <w:t>商品名・特徴・ターゲットを入力するだけで、AIが売れるセールスレターを自動生成。ヘッドライン、ベネフィット、お客様の声、CTA — プロのライターが書いたような構成が一瞬で完成します。</w:t>
+      </w:r>
+    </w:p>
+    <w:p>
+      <w:r>
+        <w:t>おすすめツール: セールスライター — AIが売れる文章を自動生成</w:t>
+      </w:r>
+    </w:p>
+    <w:p>
+      <w:r>
+        <w:rPr>
+          <w:b/>
+          <w:color w:val="505050"/>
+          <w:sz w:val="18"/>
+        </w:rPr>
+        <w:t>【STEP 2: 認知→購入の流れを自動化する】</w:t>
+      </w:r>
+    </w:p>
+    <w:p>
+      <w:r>
+        <w:t>ファネルで「無料コンテンツ→メルマガ登録→ステップメール→商品案内」の導線を構築。見込み客が自然に購入に至る流れをつくれば、毎回SNSで告知する必要はありません。</w:t>
+      </w:r>
+    </w:p>
+    <w:p>
+      <w:r>
+        <w:t>おすすめツール: ファネル — 集客導線を一元管理</w:t>
+      </w:r>
+    </w:p>
+    <w:p>
+      <w:r>
+        <w:rPr>
+          <w:b/>
+          <w:color w:val="505050"/>
+          <w:sz w:val="18"/>
+        </w:rPr>
+        <w:t>【STEP 3: メルマガで関係を育て、次も売る】</w:t>
+      </w:r>
+    </w:p>
+    <w:p>
+      <w:r>
+        <w:t>購入者・見込み客リストに定期的にメルマガを配信。お役立ち情報で信頼を積み重ね、新商品のリリース時には「待ってました！」と言ってもらえる関係を。</w:t>
+      </w:r>
+    </w:p>
+    <w:p>
+      <w:r>
+        <w:t>おすすめツール: メルマガ — 配信・リスト管理を簡単に</w:t>
+      </w:r>
+    </w:p>
+    <w:p>
+      <w:pPr>
+        <w:pStyle w:val="Heading3"/>
+      </w:pPr>
+      <w:r>
+        <w:t>お客様の声（イメージ）</w:t>
+      </w:r>
+    </w:p>
+    <w:p>
+      <w:r>
+        <w:rPr>
+          <w:b/>
+          <w:color w:val="505050"/>
+          <w:sz w:val="18"/>
+        </w:rPr>
+        <w:t>【Before】</w:t>
+      </w:r>
+    </w:p>
+    <w:p>
+      <w:r>
+        <w:t>Kindle本を3冊出版し、累計500ダウンロード。でも読者との接点はそこで途切れ、次の商品（オンライン講座）を出しても売上は3万円。SNSで告知しても「また宣伝か」と思われている気がして辛かった。</w:t>
+      </w:r>
+    </w:p>
+    <w:p>
+      <w:r>
+        <w:rPr>
+          <w:b/>
+          <w:color w:val="505050"/>
+          <w:sz w:val="18"/>
+        </w:rPr>
+        <w:t>【After】</w:t>
+      </w:r>
+    </w:p>
+    <w:p>
+      <w:r>
+        <w:t>Kindle本の巻末に無料診断クイズのリンクを設置し、メルマガ登録につなげる導線を構築。ステップメールで信頼を育て、オンライン講座をローンチしたら初月で30万円の売上に。しかも、メルマガ読者が自発的にSNSでシェアしてくれるようになった。</w:t>
+      </w:r>
+    </w:p>
+    <w:p>
+      <w:r>
+        <w:rPr>
+          <w:b/>
+          <w:color w:val="505050"/>
+          <w:sz w:val="18"/>
+        </w:rPr>
+        <w:t>【ペルソナ】</w:t>
+      </w:r>
+    </w:p>
+    <w:p>
+      <w:r>
+        <w:t>30代男性・オンライン講座クリエイター（副業）のイメージ</w:t>
+      </w:r>
+    </w:p>
+    <w:p>
+      <w:r>
+        <w:br w:type="page"/>
+      </w:r>
+    </w:p>
+    <w:p>
+      <w:pPr>
+        <w:pStyle w:val="Heading1"/>
+      </w:pPr>
+      <w:r>
+        <w:t>6. 店舗・教室・サロンの方へ</w:t>
+      </w:r>
+    </w:p>
+    <w:p>
+      <w:r>
+        <w:rPr>
+          <w:color w:val="646464"/>
+          <w:sz w:val="18"/>
+        </w:rPr>
+        <w:t>URL: https://makers.tokyo/for/shop</w:t>
+      </w:r>
+    </w:p>
+    <w:p/>
+    <w:p>
+      <w:pPr>
+        <w:pStyle w:val="Heading3"/>
+      </w:pPr>
+      <w:r>
+        <w:t>メタデータ（SEO）</w:t>
+      </w:r>
+    </w:p>
+    <w:p>
+      <w:r>
+        <w:rPr>
+          <w:b/>
+          <w:color w:val="505050"/>
+          <w:sz w:val="18"/>
+        </w:rPr>
+        <w:t>【title】</w:t>
+      </w:r>
+    </w:p>
+    <w:p>
+      <w:r>
+        <w:t>店舗・教室・サロンの方へ｜集客メーカー</w:t>
+      </w:r>
+    </w:p>
+    <w:p>
+      <w:r>
+        <w:rPr>
+          <w:b/>
+          <w:color w:val="505050"/>
+          <w:sz w:val="18"/>
+        </w:rPr>
+        <w:t>【description】</w:t>
+      </w:r>
+    </w:p>
+    <w:p>
+      <w:r>
+        <w:t>店舗・教室・サロンオーナー向け。リピーターが増え、口コミが自然に広がる仕組みを無料構築。診断クイズ・ガチャ・スタンプラリー・予約フォームで楽しい集客を。</w:t>
+      </w:r>
+    </w:p>
+    <w:p>
+      <w:pPr>
+        <w:pStyle w:val="Heading3"/>
+      </w:pPr>
+      <w:r>
+        <w:t>ヒーローセクション</w:t>
+      </w:r>
+    </w:p>
+    <w:p>
+      <w:r>
+        <w:rPr>
+          <w:b/>
+          <w:color w:val="505050"/>
+          <w:sz w:val="18"/>
+        </w:rPr>
+        <w:t>【バッジ】</w:t>
+      </w:r>
+    </w:p>
+    <w:p>
+      <w:r>
+        <w:t>店舗・教室・サロンの方へ</w:t>
+      </w:r>
+    </w:p>
+    <w:p>
+      <w:r>
+        <w:rPr>
+          <w:b/>
+          <w:color w:val="505050"/>
+          <w:sz w:val="18"/>
+        </w:rPr>
+        <w:t>【見出し】</w:t>
+      </w:r>
+    </w:p>
+    <w:p>
+      <w:r>
+        <w:t>リピーターが増え、口コミが自然に広がる。</w:t>
+      </w:r>
+    </w:p>
+    <w:p>
+      <w:r>
+        <w:rPr>
+          <w:b/>
+          <w:color w:val="505050"/>
+          <w:sz w:val="18"/>
+        </w:rPr>
+        <w:t>【説明文】</w:t>
+      </w:r>
+    </w:p>
+    <w:p>
+      <w:r>
+        <w:t>来店してくれたお客様が「また来たい」「友達にも教えたい」と思う体験をつくること。それが、広告費ゼロでも集客できる最強の仕組みです。</w:t>
+      </w:r>
+    </w:p>
+    <w:p>
+      <w:pPr>
+        <w:pStyle w:val="Heading3"/>
+      </w:pPr>
+      <w:r>
+        <w:t>こんなことで悩んでいませんか？</w:t>
+      </w:r>
+    </w:p>
+    <w:p>
+      <w:pPr>
+        <w:pStyle w:val="ListBullet"/>
+      </w:pPr>
+      <w:r>
+        <w:t>新規のお客様は来るけど、リピーターが定着しない</w:t>
+      </w:r>
+    </w:p>
+    <w:p>
+      <w:pPr>
+        <w:pStyle w:val="ListBullet"/>
+      </w:pPr>
+      <w:r>
+        <w:t>クーポンで集客しても、安いときだけ来る人が増えるだけ</w:t>
+      </w:r>
+    </w:p>
+    <w:p>
+      <w:pPr>
+        <w:pStyle w:val="ListBullet"/>
+      </w:pPr>
+      <w:r>
+        <w:t>Googleマップの口コミが少なく、新規が増えにくい</w:t>
+      </w:r>
+    </w:p>
+    <w:p>
+      <w:pPr>
+        <w:pStyle w:val="ListBullet"/>
+      </w:pPr>
+      <w:r>
+        <w:t>チラシやポスティングの効果が感じられなくなった</w:t>
+      </w:r>
+    </w:p>
+    <w:p>
+      <w:pPr>
+        <w:pStyle w:val="ListBullet"/>
+      </w:pPr>
+      <w:r>
+        <w:t>お店の「ファン」をつくりたいけど、何をすればいいか分からない</w:t>
+      </w:r>
+    </w:p>
+    <w:p>
+      <w:pPr>
+        <w:pStyle w:val="Heading3"/>
+      </w:pPr>
+      <w:r>
+        <w:t>「また来たい」が自然に生まれる仕組み</w:t>
+      </w:r>
+    </w:p>
+    <w:p>
+      <w:r>
+        <w:t>楽しい体験が口コミを生み、口コミが新しいお客様を連れてくる。その好循環をつくります。</w:t>
+      </w:r>
+    </w:p>
+    <w:p>
+      <w:r>
+        <w:rPr>
+          <w:b/>
+          <w:color w:val="505050"/>
+          <w:sz w:val="18"/>
+        </w:rPr>
+        <w:t>【来店が「楽しい」に変わる】</w:t>
+      </w:r>
+    </w:p>
+    <w:p>
+      <w:r>
+        <w:t>来店時にガチャやスタンプラリーで「お楽しみ」を提供。「今日は何が当たるかな？」が来店の理由になります。</w:t>
+      </w:r>
+    </w:p>
+    <w:p>
+      <w:r>
+        <w:rPr>
+          <w:b/>
+          <w:color w:val="505050"/>
+          <w:sz w:val="18"/>
+        </w:rPr>
+        <w:t>【口コミが自然に広がる】</w:t>
+      </w:r>
+    </w:p>
+    <w:p>
+      <w:r>
+        <w:t>「あなたの○○タイプ診断」を店頭やSNSで実施。結果をシェアしたくなる設計で、お客様が勝手に宣伝してくれます。</w:t>
+      </w:r>
+    </w:p>
+    <w:p>
+      <w:r>
+        <w:rPr>
+          <w:b/>
+          <w:color w:val="505050"/>
+          <w:sz w:val="18"/>
+        </w:rPr>
+        <w:t>【リピーターが定着する】</w:t>
+      </w:r>
+    </w:p>
+    <w:p>
+      <w:r>
+        <w:t>スタンプラリーで「あと○回で特典！」のモチベーションを。予約フォームで「次回予約」をその場で完了。離脱を防ぎます。</w:t>
+      </w:r>
+    </w:p>
+    <w:p>
+      <w:pPr>
+        <w:pStyle w:val="Heading3"/>
+      </w:pPr>
+      <w:r>
+        <w:t>お客様が「ファン」に変わる3ステップ</w:t>
+      </w:r>
+    </w:p>
+    <w:p>
+      <w:r>
+        <w:t>新規集客 → 来店体験 → リピート定着の流れを楽しく仕組み化。</w:t>
+      </w:r>
+    </w:p>
+    <w:p>
+      <w:r>
+        <w:rPr>
+          <w:b/>
+          <w:color w:val="505050"/>
+          <w:sz w:val="18"/>
+        </w:rPr>
+        <w:t>【STEP 1: 診断クイズで新規のお客様と接点をつくる】</w:t>
+      </w:r>
+    </w:p>
+    <w:p>
+      <w:r>
+        <w:t>「あなたにぴったりのメニュー診断」「あなたの肌タイプ診断」など、お客様が楽しみながらあなたのお店を知れる診断クイズを作成。SNSでシェアされて、新しいお客様が自然にやってきます。</w:t>
+      </w:r>
+    </w:p>
+    <w:p>
+      <w:r>
+        <w:t>おすすめツール: 診断クイズ — AIが質問・結果を自動生成</w:t>
+      </w:r>
+    </w:p>
+    <w:p>
+      <w:r>
+        <w:rPr>
+          <w:b/>
+          <w:color w:val="505050"/>
+          <w:sz w:val="18"/>
+        </w:rPr>
+        <w:t>【STEP 2: ガチャ・スタンプラリーで来店を楽しくする】</w:t>
+      </w:r>
+    </w:p>
+    <w:p>
+      <w:r>
+        <w:t>来店時にQRコードを読み取ってガチャを回す、スタンプを貯めるなど、来店自体が楽しいイベントに。「今日は何が当たるかな？」がお客様の来店動機になり、リピート率が劇的に上がります。</w:t>
+      </w:r>
+    </w:p>
+    <w:p>
+      <w:r>
+        <w:t>おすすめツール: ガチャ / スタンプラリー — 来店特典をゲーム化</w:t>
+      </w:r>
+    </w:p>
+    <w:p>
+      <w:r>
+        <w:rPr>
+          <w:b/>
+          <w:color w:val="505050"/>
+          <w:sz w:val="18"/>
+        </w:rPr>
+        <w:t>【STEP 3: 次回予約をその場で完了させる】</w:t>
+      </w:r>
+    </w:p>
+    <w:p>
+      <w:r>
+        <w:t>施術後・レッスン後に「次回のご予約はこちら」とQRコードを提示。カレンダーから空き日時を選ぶだけなので、お客様も楽。「帰ったら予約しよう」の「帰ったら忘れた」を防ぎます。</w:t>
+      </w:r>
+    </w:p>
+    <w:p>
+      <w:r>
+        <w:t>おすすめツール: 予約フォーム — QRコードで即予約</w:t>
+      </w:r>
+    </w:p>
+    <w:p>
+      <w:pPr>
+        <w:pStyle w:val="Heading3"/>
+      </w:pPr>
+      <w:r>
+        <w:t>お客様の声（イメージ）</w:t>
+      </w:r>
+    </w:p>
+    <w:p>
+      <w:r>
+        <w:rPr>
+          <w:b/>
+          <w:color w:val="505050"/>
+          <w:sz w:val="18"/>
+        </w:rPr>
+        <w:t>【Before】</w:t>
+      </w:r>
+    </w:p>
+    <w:p>
+      <w:r>
+        <w:t>個人サロンを開業して2年。新規は月5名ほど来るが、リピートは30%程度。ホットペッパーのクーポン目当ての人が多く、定価で来てくれるお客様が増えず、月商は30万円前後で頭打ちだった。</w:t>
+      </w:r>
+    </w:p>
+    <w:p>
+      <w:r>
+        <w:rPr>
+          <w:b/>
+          <w:color w:val="505050"/>
+          <w:sz w:val="18"/>
+        </w:rPr>
+        <w:t>【After】</w:t>
+      </w:r>
+    </w:p>
+    <w:p>
+      <w:r>
+        <w:t>来店時のガチャ（次回使える割引やプレゼントが当たる）とスタンプラリーを導入。お客様が「今日ガチャで当たった！」とInstagramに投稿してくれるように。リピート率が60%に上がり、口コミ経由の新規も増えて月商50万円を突破。</w:t>
+      </w:r>
+    </w:p>
+    <w:p>
+      <w:r>
+        <w:rPr>
+          <w:b/>
+          <w:color w:val="505050"/>
+          <w:sz w:val="18"/>
+        </w:rPr>
+        <w:t>【ペルソナ】</w:t>
+      </w:r>
+    </w:p>
+    <w:p>
+      <w:r>
+        <w:t>30代女性・ネイルサロンオーナー（個人経営）のイメージ</w:t>
+      </w:r>
+    </w:p>
+    <w:p>
+      <w:r>
+        <w:br w:type="page"/>
+      </w:r>
+    </w:p>
+    <w:p>
+      <w:pPr>
+        <w:pStyle w:val="Heading1"/>
+      </w:pPr>
+      <w:r>
+        <w:t>7. 法人・チームの方へ</w:t>
+      </w:r>
+    </w:p>
+    <w:p>
+      <w:r>
+        <w:rPr>
+          <w:color w:val="646464"/>
+          <w:sz w:val="18"/>
+        </w:rPr>
+        <w:t>URL: https://makers.tokyo/for/business</w:t>
+      </w:r>
+    </w:p>
+    <w:p/>
+    <w:p>
+      <w:pPr>
+        <w:pStyle w:val="Heading3"/>
+      </w:pPr>
+      <w:r>
+        <w:t>メタデータ（SEO）</w:t>
+      </w:r>
+    </w:p>
+    <w:p>
+      <w:r>
+        <w:rPr>
+          <w:b/>
+          <w:color w:val="505050"/>
+          <w:sz w:val="18"/>
+        </w:rPr>
+        <w:t>【title】</w:t>
+      </w:r>
+    </w:p>
+    <w:p>
+      <w:r>
+        <w:t>法人・チームの方へ｜集客メーカー</w:t>
+      </w:r>
+    </w:p>
+    <w:p>
+      <w:r>
+        <w:rPr>
+          <w:b/>
+          <w:color w:val="505050"/>
+          <w:sz w:val="18"/>
+        </w:rPr>
+        <w:t>【description】</w:t>
+      </w:r>
+    </w:p>
+    <w:p>
+      <w:r>
+        <w:t>中小企業・スタートアップ・チーム向け。マーケティング基盤を一元化。LP・ファネル・アンケート・ステップメールで集客から成約まで統合管理。</w:t>
+      </w:r>
+    </w:p>
+    <w:p>
+      <w:pPr>
+        <w:pStyle w:val="Heading3"/>
+      </w:pPr>
+      <w:r>
+        <w:t>ヒーローセクション</w:t>
+      </w:r>
+    </w:p>
+    <w:p>
+      <w:r>
+        <w:rPr>
+          <w:b/>
+          <w:color w:val="505050"/>
+          <w:sz w:val="18"/>
+        </w:rPr>
+        <w:t>【バッジ】</w:t>
+      </w:r>
+    </w:p>
+    <w:p>
+      <w:r>
+        <w:t>法人・チーム運営の方へ</w:t>
+      </w:r>
+    </w:p>
+    <w:p>
+      <w:r>
+        <w:rPr>
+          <w:b/>
+          <w:color w:val="505050"/>
+          <w:sz w:val="18"/>
+        </w:rPr>
+        <w:t>【見出し】</w:t>
+      </w:r>
+    </w:p>
+    <w:p>
+      <w:r>
+        <w:t>マーケティング基盤を、ひとつにまとめる。</w:t>
+      </w:r>
+    </w:p>
+    <w:p>
+      <w:r>
+        <w:rPr>
+          <w:b/>
+          <w:color w:val="505050"/>
+          <w:sz w:val="18"/>
+        </w:rPr>
+        <w:t>【説明文】</w:t>
+      </w:r>
+    </w:p>
+    <w:p>
+      <w:r>
+        <w:t>LP作成、リード獲得、アンケート、メール配信…バラバラのツールを行き来するのはもう終わり。集客から成約まで、チームで使える統合プラットフォームを。</w:t>
+      </w:r>
+    </w:p>
+    <w:p>
+      <w:pPr>
+        <w:pStyle w:val="Heading3"/>
+      </w:pPr>
+      <w:r>
+        <w:t>こんなことで悩んでいませんか？</w:t>
+      </w:r>
+    </w:p>
+    <w:p>
+      <w:pPr>
+        <w:pStyle w:val="ListBullet"/>
+      </w:pPr>
+      <w:r>
+        <w:t>LP作成・メール配信・フォーム…ツールごとに月額費用がかさむ</w:t>
+      </w:r>
+    </w:p>
+    <w:p>
+      <w:pPr>
+        <w:pStyle w:val="ListBullet"/>
+      </w:pPr>
+      <w:r>
+        <w:t>マーケティング施策のデータが各ツールに散らばっている</w:t>
+      </w:r>
+    </w:p>
+    <w:p>
+      <w:pPr>
+        <w:pStyle w:val="ListBullet"/>
+      </w:pPr>
+      <w:r>
+        <w:t>担当者が変わるたびに、ツールの使い方を教え直す必要がある</w:t>
+      </w:r>
+    </w:p>
+    <w:p>
+      <w:pPr>
+        <w:pStyle w:val="ListBullet"/>
+      </w:pPr>
+      <w:r>
+        <w:t>「とりあえずGoogleフォーム」が定着してしまい、見た目がイマイチ</w:t>
+      </w:r>
+    </w:p>
+    <w:p>
+      <w:pPr>
+        <w:pStyle w:val="ListBullet"/>
+      </w:pPr>
+      <w:r>
+        <w:t>顧客の声を集めたいが、アンケートの作成・集計が手間</w:t>
+      </w:r>
+    </w:p>
+    <w:p>
+      <w:pPr>
+        <w:pStyle w:val="Heading3"/>
+      </w:pPr>
+      <w:r>
+        <w:t>一元管理でチームの生産性が上がる</w:t>
+      </w:r>
+    </w:p>
+    <w:p>
+      <w:r>
+        <w:t>ひとつのプラットフォームで、マーケティングに必要なすべてが揃います。</w:t>
+      </w:r>
+    </w:p>
+    <w:p>
+      <w:r>
+        <w:rPr>
+          <w:b/>
+          <w:color w:val="505050"/>
+          <w:sz w:val="18"/>
+        </w:rPr>
+        <w:t>【ツール統合でコスト削減】</w:t>
+      </w:r>
+    </w:p>
+    <w:p>
+      <w:r>
+        <w:t>LP作成・フォーム・メール配信・アンケート・ファネル管理がひとつに。複数ツールの月額費用を大幅に削減できます。</w:t>
+      </w:r>
+    </w:p>
+    <w:p>
+      <w:r>
+        <w:rPr>
+          <w:b/>
+          <w:color w:val="505050"/>
+          <w:sz w:val="18"/>
+        </w:rPr>
+        <w:t>【チームで簡単に使える】</w:t>
+      </w:r>
+    </w:p>
+    <w:p>
+      <w:r>
+        <w:t>テンプレートベースなので、マーケティング専任でなくても運用可能。担当者の異動にも強い仕組みです。</w:t>
+      </w:r>
+    </w:p>
+    <w:p>
+      <w:r>
+        <w:rPr>
+          <w:b/>
+          <w:color w:val="505050"/>
+          <w:sz w:val="18"/>
+        </w:rPr>
+        <w:t>【施策を素早く回せる】</w:t>
+      </w:r>
+    </w:p>
+    <w:p>
+      <w:r>
+        <w:t>キャンペーンLP → アンケート → ステップメール → 効果測定の流れを1日で構築。PDCAのスピードが圧倒的に上がります。</w:t>
+      </w:r>
+    </w:p>
+    <w:p>
+      <w:pPr>
+        <w:pStyle w:val="Heading3"/>
+      </w:pPr>
+      <w:r>
+        <w:t>法人のマーケティングを加速する3ステップ</w:t>
+      </w:r>
+    </w:p>
+    <w:p>
+      <w:r>
+        <w:t>集客 → リード獲得 → ナーチャリングの流れを統合プラットフォームで。</w:t>
+      </w:r>
+    </w:p>
+    <w:p>
+      <w:r>
+        <w:rPr>
+          <w:b/>
+          <w:color w:val="505050"/>
+          <w:sz w:val="18"/>
+        </w:rPr>
+        <w:t>【STEP 1: キャンペーンLP・商品ページを素早くつくる】</w:t>
+      </w:r>
+    </w:p>
+    <w:p>
+      <w:r>
+        <w:t>テンプレートを選んでテキストを入力するだけで、プロ品質のLPが完成。外注せずに社内でスピーディーに制作できるので、施策の立ち上げが圧倒的に速くなります。</w:t>
+      </w:r>
+    </w:p>
+    <w:p>
+      <w:r>
+        <w:t>おすすめツール: ビジネスLP — テンプレートから即制作</w:t>
+      </w:r>
+    </w:p>
+    <w:p>
+      <w:r>
+        <w:rPr>
+          <w:b/>
+          <w:color w:val="505050"/>
+          <w:sz w:val="18"/>
+        </w:rPr>
+        <w:t>【STEP 2: アンケート・フォームでリードを獲得する】</w:t>
+      </w:r>
+    </w:p>
+    <w:p>
+      <w:r>
+        <w:t>顧客アンケート、お問い合わせフォーム、資料請求フォームをテンプレートから作成。Googleフォームでは出せないブランド感を維持しながら、回答データを一元管理。</w:t>
+      </w:r>
+    </w:p>
+    <w:p>
+      <w:r>
+        <w:t>おすすめツール: アンケート / 申込フォーム — ブランドに合ったフォーム</w:t>
+      </w:r>
+    </w:p>
+    <w:p>
+      <w:r>
+        <w:rPr>
+          <w:b/>
+          <w:color w:val="505050"/>
+          <w:sz w:val="18"/>
+        </w:rPr>
+        <w:t>【STEP 3: ステップメールで見込み客を育てる】</w:t>
+      </w:r>
+    </w:p>
+    <w:p>
+      <w:r>
+        <w:t>資料請求やアンケート回答者に自動でフォローアップメールを配信。「お役立ち情報→事例→商談のご案内」のシナリオを設定すれば、営業の負担を減らしながらリードを育てられます。</w:t>
+      </w:r>
+    </w:p>
+    <w:p>
+      <w:r>
+        <w:t>おすすめツール: ステップメール — 自動メールシナリオ配信</w:t>
+      </w:r>
+    </w:p>
+    <w:p>
+      <w:pPr>
+        <w:pStyle w:val="Heading3"/>
+      </w:pPr>
+      <w:r>
+        <w:t>お客様の声（イメージ）</w:t>
+      </w:r>
+    </w:p>
+    <w:p>
+      <w:r>
+        <w:rPr>
+          <w:b/>
+          <w:color w:val="505050"/>
+          <w:sz w:val="18"/>
+        </w:rPr>
+        <w:t>【Before】</w:t>
+      </w:r>
+    </w:p>
+    <w:p>
+      <w:r>
+        <w:t>LP作成はWixで月額2,000円、フォームはGoogleフォーム（デザインが微妙）、メール配信はMailchimpで月$30。データが各ツールに散らばり、マーケティング担当が退職したら引き継ぎに2ヶ月かかった。年間のツール費用は合計15万円超。</w:t>
+      </w:r>
+    </w:p>
+    <w:p>
+      <w:r>
+        <w:rPr>
+          <w:b/>
+          <w:color w:val="505050"/>
+          <w:sz w:val="18"/>
+        </w:rPr>
+        <w:t>【After】</w:t>
+      </w:r>
+    </w:p>
+    <w:p>
+      <w:r>
+        <w:t>集客メーカーに統合したら、ツール費用が月額4,980円に。テンプレートベースなので新しい担当者もすぐに使えた。LP公開→アンケート→ステップメールの流れが1日で構築でき、施策のスピードが3倍に。</w:t>
+      </w:r>
+    </w:p>
+    <w:p>
+      <w:r>
+        <w:rPr>
+          <w:b/>
+          <w:color w:val="505050"/>
+          <w:sz w:val="18"/>
+        </w:rPr>
+        <w:t>【ペルソナ】</w:t>
+      </w:r>
+    </w:p>
+    <w:p>
+      <w:r>
+        <w:t>中小企業・マーケティング担当（従業員15名）のイメージ</w:t>
+      </w:r>
+    </w:p>
+    <w:p>
+      <w:r>
+        <w:br w:type="page"/>
+      </w:r>
+    </w:p>
+    <w:p>
+      <w:pPr>
+        <w:pStyle w:val="Heading1"/>
+      </w:pPr>
+      <w:r>
+        <w:t>8. Kindle出版メーカーLP</w:t>
       </w:r>
     </w:p>
     <w:p>
@@ -3527,7 +5633,7 @@
         <w:pStyle w:val="Heading1"/>
       </w:pPr>
       <w:r>
-        <w:t>3. Kindle代理店パートナー募集</w:t>
+        <w:t>9. Kindle代理店パートナー募集</w:t>
       </w:r>
     </w:p>
     <w:p>
@@ -4206,7 +6312,7 @@
         <w:pStyle w:val="Heading1"/>
       </w:pPr>
       <w:r>
-        <w:t>4. 開発支援・応援ページ</w:t>
+        <w:t>10. 開発支援・応援ページ</w:t>
       </w:r>
     </w:p>
     <w:p>
@@ -4454,7 +6560,7 @@
         <w:pStyle w:val="Heading1"/>
       </w:pPr>
       <w:r>
-        <w:t>5. 料金プラン</w:t>
+        <w:t>11. 料金プラン</w:t>
       </w:r>
     </w:p>
     <w:p>
@@ -5378,7 +7484,7 @@
         <w:pStyle w:val="Heading1"/>
       </w:pPr>
       <w:r>
-        <w:t>6. 全ツール一覧</w:t>
+        <w:t>12. 全ツール一覧</w:t>
       </w:r>
     </w:p>
     <w:p>
@@ -5833,7 +7939,7 @@
         <w:pStyle w:val="Heading1"/>
       </w:pPr>
       <w:r>
-        <w:t>7. 診断クイズメーカーLP</w:t>
+        <w:t>13. 診断クイズメーカーLP</w:t>
       </w:r>
     </w:p>
     <w:p>
@@ -6281,7 +8387,7 @@
         <w:pStyle w:val="Heading1"/>
       </w:pPr>
       <w:r>
-        <w:t>8. プロフィールメーカーLP</w:t>
+        <w:t>14. プロフィールメーカーLP</w:t>
       </w:r>
     </w:p>
     <w:p>
@@ -6729,7 +8835,7 @@
         <w:pStyle w:val="Heading1"/>
       </w:pPr>
       <w:r>
-        <w:t>9. LPメーカーLP</w:t>
+        <w:t>15. LPメーカーLP</w:t>
       </w:r>
     </w:p>
     <w:p>
@@ -7177,7 +9283,7 @@
         <w:pStyle w:val="Heading1"/>
       </w:pPr>
       <w:r>
-        <w:t>10. セールスライターLP</w:t>
+        <w:t>16. セールスライターLP</w:t>
       </w:r>
     </w:p>
     <w:p>
@@ -7625,7 +9731,7 @@
         <w:pStyle w:val="Heading1"/>
       </w:pPr>
       <w:r>
-        <w:t>11. 予約メーカーLP</w:t>
+        <w:t>17. 予約メーカーLP</w:t>
       </w:r>
     </w:p>
     <w:p>
@@ -8073,7 +10179,7 @@
         <w:pStyle w:val="Heading1"/>
       </w:pPr>
       <w:r>
-        <w:t>12. アンケートメーカーLP</w:t>
+        <w:t>18. アンケートメーカーLP</w:t>
       </w:r>
     </w:p>
     <w:p>
@@ -8521,7 +10627,7 @@
         <w:pStyle w:val="Heading1"/>
       </w:pPr>
       <w:r>
-        <w:t>13. メルマガメーカーLP</w:t>
+        <w:t>19. メルマガメーカーLP</w:t>
       </w:r>
     </w:p>
     <w:p>
@@ -8969,7 +11075,7 @@
         <w:pStyle w:val="Heading1"/>
       </w:pPr>
       <w:r>
-        <w:t>14. ゲーミフィケーションLP</w:t>
+        <w:t>20. ゲーミフィケーションLP</w:t>
       </w:r>
     </w:p>
     <w:p>
@@ -9417,7 +11523,7 @@
         <w:pStyle w:val="Heading1"/>
       </w:pPr>
       <w:r>
-        <w:t>15. ウェビナーLPメーカーLP</w:t>
+        <w:t>21. ウェビナーLPメーカーLP</w:t>
       </w:r>
     </w:p>
     <w:p>
@@ -9865,7 +11971,7 @@
         <w:pStyle w:val="Heading1"/>
       </w:pPr>
       <w:r>
-        <w:t>16. ファネルメーカーLP</w:t>
+        <w:t>22. ファネルメーカーLP</w:t>
       </w:r>
     </w:p>
     <w:p>
@@ -10281,7 +12387,7 @@
         <w:pStyle w:val="Heading1"/>
       </w:pPr>
       <w:r>
-        <w:t>17. 申し込みフォームLP</w:t>
+        <w:t>23. 申し込みフォームLP</w:t>
       </w:r>
     </w:p>
     <w:p>
@@ -10713,7 +12819,7 @@
         <w:pStyle w:val="Heading1"/>
       </w:pPr>
       <w:r>
-        <w:t>18. マイサイトメーカーLP</w:t>
+        <w:t>24. マイサイトメーカーLP</w:t>
       </w:r>
     </w:p>
     <w:p>
@@ -11161,7 +13267,7 @@
         <w:pStyle w:val="Heading1"/>
       </w:pPr>
       <w:r>
-        <w:t>19. ガイドメーカーLP</w:t>
+        <w:t>25. ガイドメーカーLP</w:t>
       </w:r>
     </w:p>
     <w:p>
@@ -11609,7 +13715,7 @@
         <w:pStyle w:val="Heading1"/>
       </w:pPr>
       <w:r>
-        <w:t>20. SNS投稿メーカーLP</w:t>
+        <w:t>26. SNS投稿メーカーLP</w:t>
       </w:r>
     </w:p>
     <w:p>
@@ -12057,7 +14163,7 @@
         <w:pStyle w:val="Heading1"/>
       </w:pPr>
       <w:r>
-        <w:t>21. サムネイルメーカーLP</w:t>
+        <w:t>27. サムネイルメーカーLP</w:t>
       </w:r>
     </w:p>
     <w:p>
@@ -12505,7 +14611,7 @@
         <w:pStyle w:val="Heading1"/>
       </w:pPr>
       <w:r>
-        <w:t>22. アフィリエイトLP</w:t>
+        <w:t>28. アフィリエイトLP</w:t>
       </w:r>
     </w:p>
     <w:p>
@@ -12953,7 +15059,7 @@
         <w:pStyle w:val="Heading1"/>
       </w:pPr>
       <w:r>
-        <w:t>23. 効果的な活用法9選</w:t>
+        <w:t>29. 効果的な活用法9選</w:t>
       </w:r>
     </w:p>
     <w:p>
@@ -13177,7 +15283,7 @@
         <w:pStyle w:val="Heading1"/>
       </w:pPr>
       <w:r>
-        <w:t>24. 売れるコンテンツの作り方</w:t>
+        <w:t>30. 売れるコンテンツの作り方</w:t>
       </w:r>
     </w:p>
     <w:p>
@@ -13353,7 +15459,7 @@
         <w:pStyle w:val="Heading1"/>
       </w:pPr>
       <w:r>
-        <w:t>25. 使い方・機能一覧</w:t>
+        <w:t>31. 使い方・機能一覧</w:t>
       </w:r>
     </w:p>
     <w:p>
@@ -13782,7 +15888,7 @@
         <w:pStyle w:val="Heading1"/>
       </w:pPr>
       <w:r>
-        <w:t>26. よくある質問</w:t>
+        <w:t>32. よくある質問</w:t>
       </w:r>
     </w:p>
     <w:p>
@@ -14039,7 +16145,7 @@
         <w:pStyle w:val="Heading1"/>
       </w:pPr>
       <w:r>
-        <w:t>27. お問い合わせ</w:t>
+        <w:t>33. お問い合わせ</w:t>
       </w:r>
     </w:p>
     <w:p>
@@ -14082,7 +16188,7 @@
         <w:pStyle w:val="Heading1"/>
       </w:pPr>
       <w:r>
-        <w:t>28. お知らせ</w:t>
+        <w:t>34. お知らせ</w:t>
       </w:r>
     </w:p>
     <w:p>
@@ -14148,7 +16254,7 @@
         <w:pStyle w:val="Heading1"/>
       </w:pPr>
       <w:r>
-        <w:t>29. 特定商取引法に基づく表記</w:t>
+        <w:t>35. 特定商取引法に基づく表記</w:t>
       </w:r>
     </w:p>
     <w:p>
@@ -14306,7 +16412,7 @@
         <w:pStyle w:val="Heading1"/>
       </w:pPr>
       <w:r>
-        <w:t>30. プライバシーポリシー</w:t>
+        <w:t>36. プライバシーポリシー</w:t>
       </w:r>
     </w:p>
     <w:p>

</xml_diff>